<commit_message>
Add soft skills and French language to resume, improving design consistency
Updates resume generation to include a "Core Strengths" section with soft skills and French language proficiency, along with design enhancements for both PDF and DOCX formats.

Replit-Commit-Author: Agent
Replit-Commit-Session-Id: a276fce4-5f81-491e-b88f-5e34432cb028
Replit-Commit-Checkpoint-Type: full_checkpoint
Replit-Commit-Event-Id: dba41fdf-b866-46b0-bf32-86ec09c24c68
Replit-Helium-Checkpoint-Created: true
</commit_message>
<xml_diff>
--- a/outputs/Axel-Saerens-resume.docx
+++ b/outputs/Axel-Saerens-resume.docx
@@ -57,6 +57,38 @@
           <w:szCs w:val="21"/>
         </w:rPr>
         <w:t xml:space="preserve">Account Strategist who already sold and managed the Belgian and Dutch SMB market at Google Customer Solutions — hitting quota every quarter and earning a Sales Captain promotion — before building a Google Ads agency from zero. Combines deep platform and conversion-tracking expertise with consultative selling to grow advertiser revenue and own a portfolio end to end.</w:t>
+      </w:r>
+    </w:p>
+    <w:p>
+      <w:pPr>
+        <w:pBdr>
+          <w:bottom w:val="single" w:color="E4E2EE" w:sz="6" w:space="3"/>
+        </w:pBdr>
+        <w:spacing w:after="100" w:before="200"/>
+      </w:pPr>
+      <w:r>
+        <w:rPr>
+          <w:b/>
+          <w:bCs/>
+          <w:color w:val="29274E"/>
+          <w:spacing w:val="12"/>
+          <w:sz w:val="21"/>
+          <w:szCs w:val="21"/>
+        </w:rPr>
+        <w:t xml:space="preserve">CORE STRENGTHS</w:t>
+      </w:r>
+    </w:p>
+    <w:p>
+      <w:pPr>
+        <w:spacing w:after="40"/>
+      </w:pPr>
+      <w:r>
+        <w:rPr>
+          <w:color w:val="1A1A22"/>
+          <w:sz w:val="21"/>
+          <w:szCs w:val="21"/>
+        </w:rPr>
+        <w:t xml:space="preserve">Consultative selling    ·    Relationship building    ·    Coaching &amp; enablement    ·    Stakeholder communication    ·    Autonomous ownership    ·    Data-driven decisions    ·    Adaptability</w:t>
       </w:r>
     </w:p>
     <w:p>
@@ -483,7 +515,7 @@
           <w:sz w:val="21"/>
           <w:szCs w:val="21"/>
         </w:rPr>
-        <w:t xml:space="preserve">Dutch (native), English (fluent)</w:t>
+        <w:t xml:space="preserve">Dutch (native), English (fluent), French (conversational)</w:t>
       </w:r>
     </w:p>
     <w:p>

</xml_diff>

<commit_message>
Add certifications and update contact information on resume
Adds a "Certifications" section to the resume, includes phone number and LinkedIn to contact details, and adjusts layout for PDF and DOCX formats.

Replit-Commit-Author: Agent
Replit-Commit-Session-Id: a276fce4-5f81-491e-b88f-5e34432cb028
Replit-Commit-Checkpoint-Type: full_checkpoint
Replit-Commit-Event-Id: b8df1094-e123-4cfb-bef7-20f5aeb850cf
Replit-Helium-Checkpoint-Created: true
</commit_message>
<xml_diff>
--- a/outputs/Axel-Saerens-resume.docx
+++ b/outputs/Axel-Saerens-resume.docx
@@ -43,7 +43,16 @@
           <w:sz w:val="18"/>
           <w:szCs w:val="18"/>
         </w:rPr>
-        <w:t xml:space="preserve">Belgium · open to relocating to Dublin    |    ax.saerens@gmail.com    |    saerensadvertising.com</w:t>
+        <w:t xml:space="preserve">Belgium · open to relocating to Dublin    |    +32 486 43 09 71    |    ax.saerens@gmail.com</w:t>
+      </w:r>
+      <w:r>
+        <w:rPr>
+          <w:color w:val="6B6B72"/>
+          <w:sz w:val="18"/>
+          <w:szCs w:val="18"/>
+        </w:rPr>
+        <w:br/>
+        <w:t xml:space="preserve">linkedin.com/in/srnsa    |    saerensadvertising.com</w:t>
       </w:r>
     </w:p>
     <w:p>
@@ -516,6 +525,71 @@
           <w:szCs w:val="21"/>
         </w:rPr>
         <w:t xml:space="preserve">Dutch (native), English (fluent), French (conversational)</w:t>
+      </w:r>
+    </w:p>
+    <w:p>
+      <w:pPr>
+        <w:pBdr>
+          <w:bottom w:val="single" w:color="E4E2EE" w:sz="6" w:space="3"/>
+        </w:pBdr>
+        <w:spacing w:after="100" w:before="200"/>
+      </w:pPr>
+      <w:r>
+        <w:rPr>
+          <w:b/>
+          <w:bCs/>
+          <w:color w:val="29274E"/>
+          <w:spacing w:val="12"/>
+          <w:sz w:val="21"/>
+          <w:szCs w:val="21"/>
+        </w:rPr>
+        <w:t xml:space="preserve">CERTIFICATIONS</w:t>
+      </w:r>
+    </w:p>
+    <w:p>
+      <w:pPr>
+        <w:spacing w:after="40"/>
+      </w:pPr>
+      <w:r>
+        <w:rPr>
+          <w:b/>
+          <w:bCs/>
+          <w:color w:val="29274E"/>
+          <w:sz w:val="21"/>
+          <w:szCs w:val="21"/>
+        </w:rPr>
+        <w:t xml:space="preserve">Google Ads:  </w:t>
+      </w:r>
+      <w:r>
+        <w:rPr>
+          <w:color w:val="1A1A22"/>
+          <w:sz w:val="21"/>
+          <w:szCs w:val="21"/>
+        </w:rPr>
+        <w:t xml:space="preserve">Search, Display, Video, Shopping, Measurement, Apps, Demand Gen, AI-Powered Performance (Performance Max)</w:t>
+      </w:r>
+    </w:p>
+    <w:p>
+      <w:pPr>
+        <w:spacing w:after="40"/>
+      </w:pPr>
+      <w:r>
+        <w:rPr>
+          <w:b/>
+          <w:bCs/>
+          <w:color w:val="29274E"/>
+          <w:sz w:val="21"/>
+          <w:szCs w:val="21"/>
+        </w:rPr>
+        <w:t xml:space="preserve">Analytics:  </w:t>
+      </w:r>
+      <w:r>
+        <w:rPr>
+          <w:color w:val="1A1A22"/>
+          <w:sz w:val="21"/>
+          <w:szCs w:val="21"/>
+        </w:rPr>
+        <w:t xml:space="preserve">Google Analytics (GA4) Certification</w:t>
       </w:r>
     </w:p>
     <w:p>

</xml_diff>